<commit_message>
'Add' 1.'AmmuOarish.pdf' & 2.'Mohammad Rakibul Islam.pdf'.
</commit_message>
<xml_diff>
--- a/1.Main/Mohammad Rakibul Islam.docx
+++ b/1.Main/Mohammad Rakibul Islam.docx
@@ -789,7 +789,19 @@
         <w:rPr>
           <w:b/>
         </w:rPr>
-        <w:t>Asynchronous Data Operation.</w:t>
+        <w:t>Asynchronous Data Operation</w:t>
+      </w:r>
+      <w:r>
+        <w:rPr>
+          <w:b/>
+        </w:rPr>
+        <w:t>s</w:t>
+      </w:r>
+      <w:r>
+        <w:rPr>
+          <w:b/>
+        </w:rPr>
+        <w:t>.</w:t>
       </w:r>
     </w:p>
     <w:p>

</xml_diff>

<commit_message>
1.'github' add to 'CV' & 2.'Add' 'Dubil_Shirajganj_Recipt'.
</commit_message>
<xml_diff>
--- a/1.Main/Mohammad Rakibul Islam.docx
+++ b/1.Main/Mohammad Rakibul Islam.docx
@@ -4,6 +4,7 @@
   <w:body>
     <w:p>
       <w:pPr>
+        <w:spacing w:after="0"/>
         <w:ind w:left="-630"/>
         <w:jc w:val="right"/>
         <w:rPr>
@@ -61,6 +62,9 @@
         </w:drawing>
       </w:r>
       <w:r>
+        <w:t xml:space="preserve">            </w:t>
+      </w:r>
+      <w:r>
         <w:t xml:space="preserve">                                                                                     </w:t>
       </w:r>
       <w:r>
@@ -112,6 +116,35 @@
           <w:szCs w:val="36"/>
         </w:rPr>
         <w:t>.</w:t>
+      </w:r>
+    </w:p>
+    <w:p>
+      <w:pPr>
+        <w:ind w:left="-630"/>
+        <w:jc w:val="center"/>
+        <w:rPr>
+          <w:b/>
+          <w:color w:val="0070C0"/>
+          <w:sz w:val="36"/>
+          <w:szCs w:val="36"/>
+        </w:rPr>
+      </w:pPr>
+      <w:r>
+        <w:rPr>
+          <w:b/>
+          <w:sz w:val="36"/>
+          <w:szCs w:val="36"/>
+        </w:rPr>
+        <w:t xml:space="preserve">                                         </w:t>
+      </w:r>
+      <w:r>
+        <w:rPr>
+          <w:b/>
+          <w:color w:val="0070C0"/>
+          <w:sz w:val="36"/>
+          <w:szCs w:val="36"/>
+        </w:rPr>
+        <w:t>https://github.com/RakibulAI-Islam/</w:t>
       </w:r>
     </w:p>
     <w:p>
@@ -1064,6 +1097,7 @@
           <w:sz w:val="24"/>
           <w:szCs w:val="24"/>
         </w:rPr>
+        <w:lastRenderedPageBreak/>
         <w:t>Languages:</w:t>
       </w:r>
       <w:r>

</xml_diff>

<commit_message>
1.'Add' 'Mohammad Rakibul Islam.docx'.
</commit_message>
<xml_diff>
--- a/1.Main/Mohammad Rakibul Islam.docx
+++ b/1.Main/Mohammad Rakibul Islam.docx
@@ -9,27 +9,30 @@
         <w:jc w:val="right"/>
         <w:rPr>
           <w:b/>
-          <w:sz w:val="36"/>
-          <w:szCs w:val="36"/>
-        </w:rPr>
-      </w:pPr>
-      <w:r>
-        <w:rPr>
+          <w:sz w:val="48"/>
+          <w:szCs w:val="48"/>
+        </w:rPr>
+      </w:pPr>
+      <w:r>
+        <w:rPr>
+          <w:b/>
           <w:noProof/>
+          <w:sz w:val="48"/>
+          <w:szCs w:val="48"/>
         </w:rPr>
         <w:drawing>
-          <wp:anchor distT="0" distB="0" distL="114300" distR="114300" simplePos="0" relativeHeight="251658240" behindDoc="1" locked="0" layoutInCell="1" allowOverlap="1">
+          <wp:anchor distT="0" distB="0" distL="114300" distR="114300" simplePos="0" relativeHeight="251659264" behindDoc="0" locked="0" layoutInCell="1" allowOverlap="1">
             <wp:simplePos x="0" y="0"/>
             <wp:positionH relativeFrom="column">
-              <wp:posOffset>853440</wp:posOffset>
+              <wp:posOffset>3810</wp:posOffset>
             </wp:positionH>
             <wp:positionV relativeFrom="paragraph">
-              <wp:posOffset>38100</wp:posOffset>
+              <wp:posOffset>-68580</wp:posOffset>
             </wp:positionV>
-            <wp:extent cx="1504950" cy="1356360"/>
+            <wp:extent cx="1642110" cy="1836420"/>
             <wp:effectExtent l="19050" t="0" r="0" b="0"/>
             <wp:wrapNone/>
-            <wp:docPr id="1" name="Picture 0" descr="Profile_Pic_1.jpg"/>
+            <wp:docPr id="2" name="Picture 0" descr="Profile_Pic_1.jpg"/>
             <wp:cNvGraphicFramePr>
               <a:graphicFrameLocks xmlns:a="http://schemas.openxmlformats.org/drawingml/2006/main" noChangeAspect="1"/>
             </wp:cNvGraphicFramePr>
@@ -49,7 +52,7 @@
                   <pic:spPr>
                     <a:xfrm>
                       <a:off x="0" y="0"/>
-                      <a:ext cx="1504950" cy="1356360"/>
+                      <a:ext cx="1642110" cy="1836420"/>
                     </a:xfrm>
                     <a:prstGeom prst="rect">
                       <a:avLst/>
@@ -62,60 +65,49 @@
         </w:drawing>
       </w:r>
       <w:r>
-        <w:t xml:space="preserve">            </w:t>
-      </w:r>
-      <w:r>
-        <w:t xml:space="preserve">                                                                                     </w:t>
-      </w:r>
-      <w:r>
+        <w:rPr>
+          <w:b/>
+          <w:sz w:val="48"/>
+          <w:szCs w:val="48"/>
+        </w:rPr>
+        <w:t xml:space="preserve">Mohammad </w:t>
+      </w:r>
+      <w:proofErr w:type="spellStart"/>
+      <w:r>
+        <w:rPr>
+          <w:b/>
+          <w:sz w:val="48"/>
+          <w:szCs w:val="48"/>
+        </w:rPr>
+        <w:t>Rakibul</w:t>
+      </w:r>
+      <w:proofErr w:type="spellEnd"/>
+      <w:r>
+        <w:rPr>
+          <w:b/>
+          <w:sz w:val="48"/>
+          <w:szCs w:val="48"/>
+        </w:rPr>
+        <w:t xml:space="preserve"> Islam.</w:t>
+      </w:r>
+    </w:p>
+    <w:p>
+      <w:pPr>
+        <w:ind w:left="-630"/>
+        <w:jc w:val="center"/>
         <w:rPr>
           <w:b/>
           <w:sz w:val="36"/>
           <w:szCs w:val="36"/>
         </w:rPr>
-        <w:t>Moh</w:t>
-      </w:r>
+      </w:pPr>
       <w:r>
         <w:rPr>
           <w:b/>
           <w:sz w:val="36"/>
           <w:szCs w:val="36"/>
         </w:rPr>
-        <w:t>a</w:t>
-      </w:r>
-      <w:r>
-        <w:rPr>
-          <w:b/>
-          <w:sz w:val="36"/>
-          <w:szCs w:val="36"/>
-        </w:rPr>
-        <w:t xml:space="preserve">mmad </w:t>
-      </w:r>
-      <w:proofErr w:type="spellStart"/>
-      <w:r>
-        <w:rPr>
-          <w:b/>
-          <w:sz w:val="36"/>
-          <w:szCs w:val="36"/>
-        </w:rPr>
-        <w:t>Rakibul</w:t>
-      </w:r>
-      <w:proofErr w:type="spellEnd"/>
-      <w:r>
-        <w:rPr>
-          <w:b/>
-          <w:sz w:val="36"/>
-          <w:szCs w:val="36"/>
-        </w:rPr>
-        <w:t xml:space="preserve"> Islam</w:t>
-      </w:r>
-      <w:r>
-        <w:rPr>
-          <w:b/>
-          <w:sz w:val="36"/>
-          <w:szCs w:val="36"/>
-        </w:rPr>
-        <w:t>.</w:t>
+        <w:t xml:space="preserve">                                         </w:t>
       </w:r>
     </w:p>
     <w:p>
@@ -135,7 +127,7 @@
           <w:sz w:val="36"/>
           <w:szCs w:val="36"/>
         </w:rPr>
-        <w:t xml:space="preserve">                                         </w:t>
+        <w:t xml:space="preserve">                                           </w:t>
       </w:r>
       <w:r>
         <w:rPr>
@@ -156,10 +148,7 @@
         </w:rPr>
       </w:pPr>
       <w:r>
-        <w:t xml:space="preserve">                                                                                      </w:t>
-      </w:r>
-      <w:r>
-        <w:t xml:space="preserve">                         </w:t>
+        <w:t xml:space="preserve">                                                                                                               </w:t>
       </w:r>
       <w:r>
         <w:rPr>
@@ -167,15 +156,7 @@
           <w:sz w:val="24"/>
           <w:szCs w:val="24"/>
         </w:rPr>
-        <w:t xml:space="preserve">Contact: +88 </w:t>
-      </w:r>
-      <w:r>
-        <w:rPr>
-          <w:b/>
-          <w:sz w:val="24"/>
-          <w:szCs w:val="24"/>
-        </w:rPr>
-        <w:t>01723297417.</w:t>
+        <w:t>Contact: +88 01723297417.</w:t>
       </w:r>
     </w:p>
     <w:p>
@@ -222,7 +203,19 @@
         <w:rPr>
           <w:b/>
         </w:rPr>
-        <w:t xml:space="preserve">                                                                                    </w:t>
+        <w:t xml:space="preserve">                    </w:t>
+      </w:r>
+      <w:r>
+        <w:rPr>
+          <w:b/>
+        </w:rPr>
+        <w:t xml:space="preserve">                                </w:t>
+      </w:r>
+      <w:r>
+        <w:rPr>
+          <w:b/>
+        </w:rPr>
+        <w:t xml:space="preserve">                                </w:t>
       </w:r>
       <w:r>
         <w:rPr>
@@ -242,54 +235,18 @@
         <w:rPr>
           <w:b/>
         </w:rPr>
-        <w:t xml:space="preserve">: +88 </w:t>
-      </w:r>
-      <w:r>
-        <w:rPr>
-          <w:b/>
-        </w:rPr>
-        <w:t>01759265706</w:t>
-      </w:r>
-      <w:r>
-        <w:rPr>
-          <w:b/>
-        </w:rPr>
-        <w:t>.</w:t>
-      </w:r>
-    </w:p>
-    <w:p>
-      <w:pPr>
-        <w:rPr>
-          <w:b/>
-        </w:rPr>
-      </w:pPr>
-      <w:r>
-        <w:rPr>
-          <w:b/>
-        </w:rPr>
-        <w:t xml:space="preserve">                                                                                         </w:t>
-      </w:r>
-      <w:r>
-        <w:rPr>
-          <w:b/>
-        </w:rPr>
-        <w:t xml:space="preserve">                               </w:t>
-      </w:r>
-      <w:r>
-        <w:rPr>
-          <w:b/>
-        </w:rPr>
-        <w:t>IMO: +88 01723297417.</w:t>
-      </w:r>
-    </w:p>
-    <w:p>
-      <w:pPr>
-        <w:pStyle w:val="ListParagraph"/>
-        <w:ind w:left="5130"/>
-        <w:jc w:val="right"/>
-      </w:pPr>
-      <w:r>
-        <w:rPr>
+        <w:t>: +88 01759265706.</w:t>
+      </w:r>
+    </w:p>
+    <w:p>
+      <w:pPr>
+        <w:rPr>
+          <w:b/>
+        </w:rPr>
+      </w:pPr>
+      <w:r>
+        <w:rPr>
+          <w:b/>
           <w:noProof/>
         </w:rPr>
         <w:pict>
@@ -297,14 +254,21 @@
             <v:path arrowok="t" fillok="f" o:connecttype="none"/>
             <o:lock v:ext="edit" shapetype="t"/>
           </v:shapetype>
-          <v:shape id="_x0000_s1026" type="#_x0000_t32" style="position:absolute;left:0;text-align:left;margin-left:-35.1pt;margin-top:9.15pt;width:528.6pt;height:0;z-index:251659264" o:connectortype="straight"/>
+          <v:shape id="_x0000_s1026" type="#_x0000_t32" style="position:absolute;margin-left:-30pt;margin-top:21.65pt;width:543pt;height:0;z-index:251658240" o:connectortype="straight"/>
         </w:pict>
+      </w:r>
+      <w:r>
+        <w:rPr>
+          <w:b/>
+        </w:rPr>
+        <w:t xml:space="preserve">                                                                                                                        IMO: +88 01723297417.</w:t>
       </w:r>
     </w:p>
     <w:p>
       <w:pPr>
         <w:spacing w:after="0" w:line="240" w:lineRule="auto"/>
         <w:ind w:left="-630"/>
+        <w:jc w:val="both"/>
         <w:rPr>
           <w:b/>
           <w:sz w:val="24"/>
@@ -313,7 +277,12 @@
         </w:rPr>
       </w:pPr>
       <w:r>
-        <w:t xml:space="preserve">            </w:t>
+        <w:rPr>
+          <w:b/>
+          <w:sz w:val="24"/>
+          <w:szCs w:val="24"/>
+        </w:rPr>
+        <w:t xml:space="preserve">           </w:t>
       </w:r>
       <w:r>
         <w:rPr>
@@ -329,6 +298,7 @@
       <w:pPr>
         <w:spacing w:line="240" w:lineRule="auto"/>
         <w:ind w:left="-630"/>
+        <w:jc w:val="both"/>
         <w:rPr>
           <w:b/>
         </w:rPr>
@@ -373,15 +343,16 @@
       <w:pPr>
         <w:spacing w:after="0" w:line="240" w:lineRule="auto"/>
         <w:ind w:left="-630"/>
-        <w:rPr>
-          <w:b/>
-        </w:rPr>
-      </w:pPr>
-      <w:r>
-        <w:rPr>
-          <w:b/>
-        </w:rPr>
-        <w:t xml:space="preserve">            </w:t>
+        <w:jc w:val="both"/>
+        <w:rPr>
+          <w:b/>
+        </w:rPr>
+      </w:pPr>
+      <w:r>
+        <w:rPr>
+          <w:b/>
+        </w:rPr>
+        <w:t xml:space="preserve">           </w:t>
       </w:r>
       <w:r>
         <w:rPr>
@@ -395,53 +366,44 @@
           <w:b/>
         </w:rPr>
         <w:t xml:space="preserve"> </w:t>
-      </w:r>
-      <w:r>
-        <w:rPr>
-          <w:b/>
-        </w:rPr>
-        <w:t xml:space="preserve"> B.Sc D</w:t>
-      </w:r>
-      <w:r>
-        <w:rPr>
-          <w:b/>
-        </w:rPr>
-        <w:t>egree in Information &amp; Communicat</w:t>
-      </w:r>
-      <w:r>
-        <w:rPr>
-          <w:b/>
-        </w:rPr>
-        <w:t>i</w:t>
-      </w:r>
-      <w:r>
-        <w:rPr>
-          <w:b/>
-        </w:rPr>
-        <w:t xml:space="preserve">on     </w:t>
-      </w:r>
-      <w:r>
-        <w:rPr>
-          <w:b/>
-        </w:rPr>
-        <w:t xml:space="preserve">      </w:t>
       </w:r>
     </w:p>
     <w:p>
       <w:pPr>
         <w:spacing w:after="0" w:line="240" w:lineRule="auto"/>
         <w:ind w:left="-630"/>
-        <w:rPr>
-          <w:b/>
-        </w:rPr>
-      </w:pPr>
-      <w:r>
-        <w:rPr>
-          <w:b/>
-        </w:rPr>
-        <w:t xml:space="preserve">             </w:t>
-      </w:r>
+        <w:jc w:val="both"/>
+        <w:rPr>
+          <w:b/>
+        </w:rPr>
+      </w:pPr>
+      <w:r>
+        <w:rPr>
+          <w:b/>
+        </w:rPr>
+        <w:t xml:space="preserve">            </w:t>
+      </w:r>
+      <w:proofErr w:type="spellStart"/>
       <w:proofErr w:type="gramStart"/>
+      <w:r>
+        <w:rPr>
+          <w:b/>
+        </w:rPr>
+        <w:t>B.Sc</w:t>
+      </w:r>
+      <w:proofErr w:type="spellEnd"/>
+      <w:r>
+        <w:rPr>
+          <w:b/>
+        </w:rPr>
+        <w:t xml:space="preserve"> Degree in Information &amp; Communicati</w:t>
+      </w:r>
+      <w:r>
+        <w:rPr>
+          <w:b/>
+        </w:rPr>
+        <w:t xml:space="preserve">on </w:t>
+      </w:r>
       <w:r>
         <w:rPr>
           <w:b/>
@@ -477,7 +439,7 @@
         </w:rPr>
       </w:pPr>
       <w:r>
-        <w:t xml:space="preserve">            </w:t>
+        <w:t xml:space="preserve">                       </w:t>
       </w:r>
       <w:r>
         <w:rPr>
@@ -512,21 +474,29 @@
           <w:szCs w:val="24"/>
         </w:rPr>
       </w:pPr>
-      <w:proofErr w:type="gramStart"/>
       <w:r>
         <w:rPr>
           <w:b/>
           <w:sz w:val="24"/>
           <w:szCs w:val="24"/>
         </w:rPr>
-        <w:t>Programming Languages: C, C#</w:t>
-      </w:r>
+        <w:t xml:space="preserve">           </w:t>
+      </w:r>
+      <w:proofErr w:type="gramStart"/>
       <w:r>
         <w:rPr>
           <w:b/>
           <w:sz w:val="24"/>
           <w:szCs w:val="24"/>
         </w:rPr>
+        <w:t>Programming Languages: C, C#</w:t>
+      </w:r>
+      <w:r>
+        <w:rPr>
+          <w:b/>
+          <w:sz w:val="24"/>
+          <w:szCs w:val="24"/>
+        </w:rPr>
         <w:t>.</w:t>
       </w:r>
       <w:proofErr w:type="gramEnd"/>
@@ -554,13 +524,7 @@
         <w:rPr>
           <w:b/>
         </w:rPr>
-        <w:t>Markup Languages: HTML, CSS</w:t>
-      </w:r>
-      <w:r>
-        <w:rPr>
-          <w:b/>
-        </w:rPr>
-        <w:t>.</w:t>
+        <w:t xml:space="preserve">            Markup Languages: HTML, CSS.</w:t>
       </w:r>
     </w:p>
     <w:p>
@@ -590,24 +554,20 @@
           <w:sz w:val="24"/>
           <w:szCs w:val="24"/>
         </w:rPr>
+        <w:t xml:space="preserve">           </w:t>
+      </w:r>
+      <w:r>
+        <w:rPr>
+          <w:b/>
+          <w:sz w:val="24"/>
+          <w:szCs w:val="24"/>
+        </w:rPr>
         <w:t>Database:</w:t>
       </w:r>
     </w:p>
     <w:p>
       <w:pPr>
-        <w:pStyle w:val="ListParagraph"/>
         <w:spacing w:line="240" w:lineRule="auto"/>
-        <w:ind w:left="378"/>
-        <w:rPr>
-          <w:b/>
-        </w:rPr>
-      </w:pPr>
-    </w:p>
-    <w:p>
-      <w:pPr>
-        <w:pStyle w:val="ListParagraph"/>
-        <w:spacing w:line="240" w:lineRule="auto"/>
-        <w:ind w:left="378"/>
         <w:rPr>
           <w:b/>
           <w:sz w:val="24"/>
@@ -618,6 +578,12 @@
       <w:r>
         <w:rPr>
           <w:b/>
+        </w:rPr>
+        <w:t xml:space="preserve">       </w:t>
+      </w:r>
+      <w:r>
+        <w:rPr>
+          <w:b/>
           <w:sz w:val="24"/>
           <w:szCs w:val="24"/>
           <w:u w:val="single"/>
@@ -641,7 +607,159 @@
         <w:pStyle w:val="ListParagraph"/>
         <w:numPr>
           <w:ilvl w:val="0"/>
-          <w:numId w:val="3"/>
+          <w:numId w:val="8"/>
+        </w:numPr>
+        <w:spacing w:after="0" w:line="240" w:lineRule="auto"/>
+        <w:rPr>
+          <w:b/>
+        </w:rPr>
+      </w:pPr>
+      <w:r>
+        <w:rPr>
+          <w:b/>
+        </w:rPr>
+        <w:t>Code First,</w:t>
+      </w:r>
+    </w:p>
+    <w:p>
+      <w:pPr>
+        <w:pStyle w:val="ListParagraph"/>
+        <w:numPr>
+          <w:ilvl w:val="0"/>
+          <w:numId w:val="8"/>
+        </w:numPr>
+        <w:spacing w:after="0" w:line="240" w:lineRule="auto"/>
+        <w:rPr>
+          <w:b/>
+        </w:rPr>
+      </w:pPr>
+      <w:r>
+        <w:rPr>
+          <w:b/>
+        </w:rPr>
+        <w:t>Models &amp; Data Context,</w:t>
+      </w:r>
+    </w:p>
+    <w:p>
+      <w:pPr>
+        <w:pStyle w:val="ListParagraph"/>
+        <w:numPr>
+          <w:ilvl w:val="0"/>
+          <w:numId w:val="8"/>
+        </w:numPr>
+        <w:spacing w:after="0" w:line="240" w:lineRule="auto"/>
+        <w:rPr>
+          <w:b/>
+        </w:rPr>
+      </w:pPr>
+      <w:r>
+        <w:rPr>
+          <w:b/>
+        </w:rPr>
+        <w:t>Constraints, Keys &amp; Relationships,</w:t>
+      </w:r>
+    </w:p>
+    <w:p>
+      <w:pPr>
+        <w:pStyle w:val="ListParagraph"/>
+        <w:numPr>
+          <w:ilvl w:val="0"/>
+          <w:numId w:val="8"/>
+        </w:numPr>
+        <w:spacing w:after="0" w:line="240" w:lineRule="auto"/>
+        <w:rPr>
+          <w:b/>
+        </w:rPr>
+      </w:pPr>
+      <w:r>
+        <w:rPr>
+          <w:b/>
+        </w:rPr>
+        <w:t>Data Access ( Create, Read, Update &amp; Delete),</w:t>
+      </w:r>
+    </w:p>
+    <w:p>
+      <w:pPr>
+        <w:pStyle w:val="ListParagraph"/>
+        <w:numPr>
+          <w:ilvl w:val="0"/>
+          <w:numId w:val="8"/>
+        </w:numPr>
+        <w:spacing w:after="0" w:line="240" w:lineRule="auto"/>
+        <w:rPr>
+          <w:b/>
+        </w:rPr>
+      </w:pPr>
+      <w:r>
+        <w:rPr>
+          <w:b/>
+        </w:rPr>
+        <w:t>Stored Procedures, Views &amp; Functions,</w:t>
+      </w:r>
+    </w:p>
+    <w:p>
+      <w:pPr>
+        <w:pStyle w:val="ListParagraph"/>
+        <w:numPr>
+          <w:ilvl w:val="0"/>
+          <w:numId w:val="8"/>
+        </w:numPr>
+        <w:spacing w:after="0" w:line="240" w:lineRule="auto"/>
+        <w:rPr>
+          <w:b/>
+        </w:rPr>
+      </w:pPr>
+      <w:r>
+        <w:rPr>
+          <w:b/>
+        </w:rPr>
+        <w:t>Sorting, Filtering &amp; Paging,</w:t>
+      </w:r>
+    </w:p>
+    <w:p>
+      <w:pPr>
+        <w:pStyle w:val="ListParagraph"/>
+        <w:numPr>
+          <w:ilvl w:val="0"/>
+          <w:numId w:val="8"/>
+        </w:numPr>
+        <w:spacing w:after="0" w:line="240" w:lineRule="auto"/>
+        <w:rPr>
+          <w:b/>
+        </w:rPr>
+      </w:pPr>
+      <w:r>
+        <w:rPr>
+          <w:b/>
+        </w:rPr>
+        <w:t>LINQ for Queries and Projections,</w:t>
+      </w:r>
+    </w:p>
+    <w:p>
+      <w:pPr>
+        <w:pStyle w:val="ListParagraph"/>
+        <w:numPr>
+          <w:ilvl w:val="0"/>
+          <w:numId w:val="8"/>
+        </w:numPr>
+        <w:spacing w:after="0" w:line="240" w:lineRule="auto"/>
+        <w:rPr>
+          <w:b/>
+        </w:rPr>
+      </w:pPr>
+      <w:r>
+        <w:rPr>
+          <w:b/>
+        </w:rPr>
+        <w:t>Repository &amp; Unit of Work Patterns,</w:t>
+      </w:r>
+    </w:p>
+    <w:p>
+      <w:pPr>
+        <w:pStyle w:val="ListParagraph"/>
+        <w:numPr>
+          <w:ilvl w:val="0"/>
+          <w:numId w:val="8"/>
         </w:numPr>
         <w:spacing w:line="240" w:lineRule="auto"/>
         <w:rPr>
@@ -652,7 +770,28 @@
         <w:rPr>
           <w:b/>
         </w:rPr>
-        <w:t>Code First,</w:t>
+        <w:t>Asynchronous Data Operations.</w:t>
+      </w:r>
+    </w:p>
+    <w:p>
+      <w:pPr>
+        <w:spacing w:line="240" w:lineRule="auto"/>
+        <w:rPr>
+          <w:b/>
+        </w:rPr>
+      </w:pPr>
+      <w:r>
+        <w:rPr>
+          <w:b/>
+        </w:rPr>
+        <w:t xml:space="preserve">        </w:t>
+      </w:r>
+      <w:r>
+        <w:rPr>
+          <w:b/>
+          <w:u w:val="single"/>
+        </w:rPr>
+        <w:t>ASP.NET Core:</w:t>
       </w:r>
     </w:p>
     <w:p>
@@ -660,7 +799,7 @@
         <w:pStyle w:val="ListParagraph"/>
         <w:numPr>
           <w:ilvl w:val="0"/>
-          <w:numId w:val="3"/>
+          <w:numId w:val="5"/>
         </w:numPr>
         <w:spacing w:line="240" w:lineRule="auto"/>
         <w:rPr>
@@ -671,7 +810,7 @@
         <w:rPr>
           <w:b/>
         </w:rPr>
-        <w:t>Models &amp; Data Context,</w:t>
+        <w:t>Controllers with Views,</w:t>
       </w:r>
     </w:p>
     <w:p>
@@ -679,7 +818,7 @@
         <w:pStyle w:val="ListParagraph"/>
         <w:numPr>
           <w:ilvl w:val="0"/>
-          <w:numId w:val="3"/>
+          <w:numId w:val="5"/>
         </w:numPr>
         <w:spacing w:line="240" w:lineRule="auto"/>
         <w:rPr>
@@ -690,7 +829,7 @@
         <w:rPr>
           <w:b/>
         </w:rPr>
-        <w:t>Constraints, Keys &amp; Relationships,</w:t>
+        <w:t>Razor Pages,</w:t>
       </w:r>
     </w:p>
     <w:p>
@@ -698,7 +837,7 @@
         <w:pStyle w:val="ListParagraph"/>
         <w:numPr>
           <w:ilvl w:val="0"/>
-          <w:numId w:val="3"/>
+          <w:numId w:val="5"/>
         </w:numPr>
         <w:spacing w:line="240" w:lineRule="auto"/>
         <w:rPr>
@@ -709,7 +848,7 @@
         <w:rPr>
           <w:b/>
         </w:rPr>
-        <w:t>Data Access ( Create, Read, Update &amp; Delete),</w:t>
+        <w:t>View Components,</w:t>
       </w:r>
     </w:p>
     <w:p>
@@ -717,7 +856,7 @@
         <w:pStyle w:val="ListParagraph"/>
         <w:numPr>
           <w:ilvl w:val="0"/>
-          <w:numId w:val="3"/>
+          <w:numId w:val="5"/>
         </w:numPr>
         <w:spacing w:line="240" w:lineRule="auto"/>
         <w:rPr>
@@ -728,19 +867,7 @@
         <w:rPr>
           <w:b/>
         </w:rPr>
-        <w:t>Stored P</w:t>
-      </w:r>
-      <w:r>
-        <w:rPr>
-          <w:b/>
-        </w:rPr>
-        <w:t>rocedures, Views &amp; Functions</w:t>
-      </w:r>
-      <w:r>
-        <w:rPr>
-          <w:b/>
-        </w:rPr>
-        <w:t>,</w:t>
+        <w:t>Tag Helpers,</w:t>
       </w:r>
     </w:p>
     <w:p>
@@ -748,7 +875,7 @@
         <w:pStyle w:val="ListParagraph"/>
         <w:numPr>
           <w:ilvl w:val="0"/>
-          <w:numId w:val="3"/>
+          <w:numId w:val="5"/>
         </w:numPr>
         <w:spacing w:line="240" w:lineRule="auto"/>
         <w:rPr>
@@ -759,7 +886,7 @@
         <w:rPr>
           <w:b/>
         </w:rPr>
-        <w:t>Sorting, Filtering &amp; Paging,</w:t>
+        <w:t>Build-in Tag Helpers,</w:t>
       </w:r>
     </w:p>
     <w:p>
@@ -767,7 +894,7 @@
         <w:pStyle w:val="ListParagraph"/>
         <w:numPr>
           <w:ilvl w:val="0"/>
-          <w:numId w:val="3"/>
+          <w:numId w:val="5"/>
         </w:numPr>
         <w:spacing w:line="240" w:lineRule="auto"/>
         <w:rPr>
@@ -778,13 +905,7 @@
         <w:rPr>
           <w:b/>
         </w:rPr>
-        <w:t>LINQ for Queries and Projections</w:t>
-      </w:r>
-      <w:r>
-        <w:rPr>
-          <w:b/>
-        </w:rPr>
-        <w:t>,</w:t>
+        <w:t>Forms Tag Helpers,</w:t>
       </w:r>
     </w:p>
     <w:p>
@@ -792,7 +913,7 @@
         <w:pStyle w:val="ListParagraph"/>
         <w:numPr>
           <w:ilvl w:val="0"/>
-          <w:numId w:val="3"/>
+          <w:numId w:val="5"/>
         </w:numPr>
         <w:spacing w:line="240" w:lineRule="auto"/>
         <w:rPr>
@@ -803,7 +924,7 @@
         <w:rPr>
           <w:b/>
         </w:rPr>
-        <w:t>Repository &amp; Unit of Work Patterns,</w:t>
+        <w:t>Model Binding,</w:t>
       </w:r>
     </w:p>
     <w:p>
@@ -811,7 +932,7 @@
         <w:pStyle w:val="ListParagraph"/>
         <w:numPr>
           <w:ilvl w:val="0"/>
-          <w:numId w:val="3"/>
+          <w:numId w:val="5"/>
         </w:numPr>
         <w:spacing w:line="240" w:lineRule="auto"/>
         <w:rPr>
@@ -822,36 +943,7 @@
         <w:rPr>
           <w:b/>
         </w:rPr>
-        <w:t>Asynchronous Data Operation</w:t>
-      </w:r>
-      <w:r>
-        <w:rPr>
-          <w:b/>
-        </w:rPr>
-        <w:t>s</w:t>
-      </w:r>
-      <w:r>
-        <w:rPr>
-          <w:b/>
-        </w:rPr>
-        <w:t>.</w:t>
-      </w:r>
-    </w:p>
-    <w:p>
-      <w:pPr>
-        <w:spacing w:line="240" w:lineRule="auto"/>
-        <w:ind w:left="378"/>
-        <w:rPr>
-          <w:b/>
-          <w:u w:val="single"/>
-        </w:rPr>
-      </w:pPr>
-      <w:r>
-        <w:rPr>
-          <w:b/>
-          <w:u w:val="single"/>
-        </w:rPr>
-        <w:t>ASP.NET Core:</w:t>
+        <w:t>Model Validation,</w:t>
       </w:r>
     </w:p>
     <w:p>
@@ -859,7 +951,7 @@
         <w:pStyle w:val="ListParagraph"/>
         <w:numPr>
           <w:ilvl w:val="0"/>
-          <w:numId w:val="4"/>
+          <w:numId w:val="5"/>
         </w:numPr>
         <w:spacing w:line="240" w:lineRule="auto"/>
         <w:rPr>
@@ -870,7 +962,7 @@
         <w:rPr>
           <w:b/>
         </w:rPr>
-        <w:t>Controllers with Views,</w:t>
+        <w:t>Using Filters,</w:t>
       </w:r>
     </w:p>
     <w:p>
@@ -878,7 +970,7 @@
         <w:pStyle w:val="ListParagraph"/>
         <w:numPr>
           <w:ilvl w:val="0"/>
-          <w:numId w:val="4"/>
+          <w:numId w:val="5"/>
         </w:numPr>
         <w:spacing w:line="240" w:lineRule="auto"/>
         <w:rPr>
@@ -889,7 +981,7 @@
         <w:rPr>
           <w:b/>
         </w:rPr>
-        <w:t>Razor Pages,</w:t>
+        <w:t>Creating From Application,</w:t>
       </w:r>
     </w:p>
     <w:p>
@@ -897,7 +989,7 @@
         <w:pStyle w:val="ListParagraph"/>
         <w:numPr>
           <w:ilvl w:val="0"/>
-          <w:numId w:val="4"/>
+          <w:numId w:val="5"/>
         </w:numPr>
         <w:spacing w:line="240" w:lineRule="auto"/>
         <w:rPr>
@@ -908,7 +1000,7 @@
         <w:rPr>
           <w:b/>
         </w:rPr>
-        <w:t>View Components,</w:t>
+        <w:t>Identity,</w:t>
       </w:r>
     </w:p>
     <w:p>
@@ -916,7 +1008,7 @@
         <w:pStyle w:val="ListParagraph"/>
         <w:numPr>
           <w:ilvl w:val="0"/>
-          <w:numId w:val="4"/>
+          <w:numId w:val="5"/>
         </w:numPr>
         <w:spacing w:line="240" w:lineRule="auto"/>
         <w:rPr>
@@ -927,191 +1019,13 @@
         <w:rPr>
           <w:b/>
         </w:rPr>
-        <w:t>Tag Helpers,</w:t>
-      </w:r>
-    </w:p>
-    <w:p>
-      <w:pPr>
-        <w:pStyle w:val="ListParagraph"/>
-        <w:numPr>
-          <w:ilvl w:val="0"/>
-          <w:numId w:val="4"/>
-        </w:numPr>
-        <w:spacing w:line="240" w:lineRule="auto"/>
-        <w:rPr>
-          <w:b/>
-        </w:rPr>
-      </w:pPr>
-      <w:r>
-        <w:rPr>
-          <w:b/>
-        </w:rPr>
-        <w:t>Build-in Tag Helpers,</w:t>
-      </w:r>
-    </w:p>
-    <w:p>
-      <w:pPr>
-        <w:pStyle w:val="ListParagraph"/>
-        <w:numPr>
-          <w:ilvl w:val="0"/>
-          <w:numId w:val="4"/>
-        </w:numPr>
-        <w:spacing w:line="240" w:lineRule="auto"/>
-        <w:rPr>
-          <w:b/>
-        </w:rPr>
-      </w:pPr>
-      <w:r>
-        <w:rPr>
-          <w:b/>
-        </w:rPr>
-        <w:t>Forms Tag Helpers,</w:t>
-      </w:r>
-    </w:p>
-    <w:p>
-      <w:pPr>
-        <w:pStyle w:val="ListParagraph"/>
-        <w:numPr>
-          <w:ilvl w:val="0"/>
-          <w:numId w:val="4"/>
-        </w:numPr>
-        <w:spacing w:line="240" w:lineRule="auto"/>
-        <w:rPr>
-          <w:b/>
-        </w:rPr>
-      </w:pPr>
-      <w:r>
-        <w:rPr>
-          <w:b/>
-        </w:rPr>
-        <w:t>Model Binding,</w:t>
-      </w:r>
-    </w:p>
-    <w:p>
-      <w:pPr>
-        <w:pStyle w:val="ListParagraph"/>
-        <w:numPr>
-          <w:ilvl w:val="0"/>
-          <w:numId w:val="4"/>
-        </w:numPr>
-        <w:spacing w:line="240" w:lineRule="auto"/>
-        <w:rPr>
-          <w:b/>
-        </w:rPr>
-      </w:pPr>
-      <w:r>
-        <w:rPr>
-          <w:b/>
-        </w:rPr>
-        <w:t>Model Validation,</w:t>
-      </w:r>
-    </w:p>
-    <w:p>
-      <w:pPr>
-        <w:pStyle w:val="ListParagraph"/>
-        <w:numPr>
-          <w:ilvl w:val="0"/>
-          <w:numId w:val="4"/>
-        </w:numPr>
-        <w:spacing w:line="240" w:lineRule="auto"/>
-        <w:rPr>
-          <w:b/>
-        </w:rPr>
-      </w:pPr>
-      <w:r>
-        <w:rPr>
-          <w:b/>
-        </w:rPr>
-        <w:t>Using Filters,</w:t>
-      </w:r>
-    </w:p>
-    <w:p>
-      <w:pPr>
-        <w:pStyle w:val="ListParagraph"/>
-        <w:numPr>
-          <w:ilvl w:val="0"/>
-          <w:numId w:val="4"/>
-        </w:numPr>
-        <w:spacing w:line="240" w:lineRule="auto"/>
-        <w:rPr>
-          <w:b/>
-        </w:rPr>
-      </w:pPr>
-      <w:r>
-        <w:rPr>
-          <w:b/>
-        </w:rPr>
-        <w:t>Creating From Application,</w:t>
-      </w:r>
-    </w:p>
-    <w:p>
-      <w:pPr>
-        <w:pStyle w:val="ListParagraph"/>
-        <w:numPr>
-          <w:ilvl w:val="0"/>
-          <w:numId w:val="4"/>
-        </w:numPr>
-        <w:spacing w:line="240" w:lineRule="auto"/>
-        <w:rPr>
-          <w:b/>
-        </w:rPr>
-      </w:pPr>
-      <w:r>
-        <w:rPr>
-          <w:b/>
-        </w:rPr>
-        <w:t>Identity,</w:t>
-      </w:r>
-    </w:p>
-    <w:p>
-      <w:pPr>
-        <w:pStyle w:val="ListParagraph"/>
-        <w:numPr>
-          <w:ilvl w:val="0"/>
-          <w:numId w:val="4"/>
-        </w:numPr>
-        <w:spacing w:line="240" w:lineRule="auto"/>
-        <w:rPr>
-          <w:b/>
-        </w:rPr>
-      </w:pPr>
-      <w:r>
-        <w:rPr>
-          <w:b/>
-        </w:rPr>
         <w:t>URL Routing.</w:t>
       </w:r>
     </w:p>
-    <w:p>
-      <w:pPr>
-        <w:spacing w:line="240" w:lineRule="auto"/>
-        <w:rPr>
-          <w:b/>
-          <w:sz w:val="24"/>
-          <w:szCs w:val="24"/>
-        </w:rPr>
-      </w:pPr>
-      <w:r>
-        <w:rPr>
-          <w:b/>
-          <w:sz w:val="24"/>
-          <w:szCs w:val="24"/>
-        </w:rPr>
-        <w:lastRenderedPageBreak/>
-        <w:t>Languages:</w:t>
-      </w:r>
-      <w:r>
-        <w:rPr>
-          <w:b/>
-          <w:sz w:val="24"/>
-          <w:szCs w:val="24"/>
-        </w:rPr>
-        <w:t xml:space="preserve"> English, Bengali.</w:t>
-      </w:r>
-    </w:p>
+    <w:p/>
     <w:sectPr>
       <w:pgSz w:w="12240" w:h="15840"/>
-      <w:pgMar w:top="540" w:right="900" w:bottom="1440" w:left="2340" w:header="720" w:footer="720" w:gutter="0"/>
+      <w:pgMar w:top="720" w:right="1440" w:bottom="630" w:left="1440" w:header="720" w:footer="720" w:gutter="0"/>
       <w:cols w:space="720"/>
       <w:docGrid w:linePitch="360"/>
     </w:sectPr>
@@ -1122,20 +1036,17 @@
 <file path=word/numbering.xml><?xml version="1.0" encoding="utf-8"?>
 <w:numbering xmlns:ve="http://schemas.openxmlformats.org/markup-compatibility/2006" xmlns:o="urn:schemas-microsoft-com:office:office" xmlns:r="http://schemas.openxmlformats.org/officeDocument/2006/relationships" xmlns:m="http://schemas.openxmlformats.org/officeDocument/2006/math" xmlns:v="urn:schemas-microsoft-com:vml" xmlns:wp="http://schemas.openxmlformats.org/drawingml/2006/wordprocessingDrawing" xmlns:w10="urn:schemas-microsoft-com:office:word" xmlns:w="http://schemas.openxmlformats.org/wordprocessingml/2006/main" xmlns:wne="http://schemas.microsoft.com/office/word/2006/wordml">
   <w:abstractNum w:abstractNumId="0">
-    <w:nsid w:val="05013015"/>
+    <w:nsid w:val="0FD8753E"/>
     <w:multiLevelType w:val="hybridMultilevel"/>
-    <w:tmpl w:val="C57E11F2"/>
-    <w:lvl w:ilvl="0" w:tplc="B100F3E8">
+    <w:tmpl w:val="220800D4"/>
+    <w:lvl w:ilvl="0" w:tplc="0409000F">
       <w:start w:val="1"/>
       <w:numFmt w:val="decimal"/>
       <w:lvlText w:val="%1."/>
       <w:lvlJc w:val="left"/>
       <w:pPr>
-        <w:ind w:left="378" w:hanging="360"/>
-      </w:pPr>
-      <w:rPr>
-        <w:rFonts w:hint="default"/>
-      </w:rPr>
+        <w:ind w:left="720" w:hanging="360"/>
+      </w:pPr>
     </w:lvl>
     <w:lvl w:ilvl="1" w:tplc="04090019" w:tentative="1">
       <w:start w:val="1"/>
@@ -1143,16 +1054,16 @@
       <w:lvlText w:val="%2."/>
       <w:lvlJc w:val="left"/>
       <w:pPr>
-        <w:ind w:left="1098" w:hanging="360"/>
-      </w:pPr>
-    </w:lvl>
-    <w:lvl w:ilvl="2" w:tplc="0409001B" w:tentative="1">
+        <w:ind w:left="1440" w:hanging="360"/>
+      </w:pPr>
+    </w:lvl>
+    <w:lvl w:ilvl="2" w:tplc="0409001B">
       <w:start w:val="1"/>
       <w:numFmt w:val="lowerRoman"/>
       <w:lvlText w:val="%3."/>
       <w:lvlJc w:val="right"/>
       <w:pPr>
-        <w:ind w:left="1818" w:hanging="180"/>
+        <w:ind w:left="2160" w:hanging="180"/>
       </w:pPr>
     </w:lvl>
     <w:lvl w:ilvl="3" w:tplc="0409000F" w:tentative="1">
@@ -1161,7 +1072,7 @@
       <w:lvlText w:val="%4."/>
       <w:lvlJc w:val="left"/>
       <w:pPr>
-        <w:ind w:left="2538" w:hanging="360"/>
+        <w:ind w:left="2880" w:hanging="360"/>
       </w:pPr>
     </w:lvl>
     <w:lvl w:ilvl="4" w:tplc="04090019" w:tentative="1">
@@ -1170,7 +1081,7 @@
       <w:lvlText w:val="%5."/>
       <w:lvlJc w:val="left"/>
       <w:pPr>
-        <w:ind w:left="3258" w:hanging="360"/>
+        <w:ind w:left="3600" w:hanging="360"/>
       </w:pPr>
     </w:lvl>
     <w:lvl w:ilvl="5" w:tplc="0409001B" w:tentative="1">
@@ -1179,7 +1090,7 @@
       <w:lvlText w:val="%6."/>
       <w:lvlJc w:val="right"/>
       <w:pPr>
-        <w:ind w:left="3978" w:hanging="180"/>
+        <w:ind w:left="4320" w:hanging="180"/>
       </w:pPr>
     </w:lvl>
     <w:lvl w:ilvl="6" w:tplc="0409000F" w:tentative="1">
@@ -1188,7 +1099,7 @@
       <w:lvlText w:val="%7."/>
       <w:lvlJc w:val="left"/>
       <w:pPr>
-        <w:ind w:left="4698" w:hanging="360"/>
+        <w:ind w:left="5040" w:hanging="360"/>
       </w:pPr>
     </w:lvl>
     <w:lvl w:ilvl="7" w:tplc="04090019" w:tentative="1">
@@ -1197,7 +1108,7 @@
       <w:lvlText w:val="%8."/>
       <w:lvlJc w:val="left"/>
       <w:pPr>
-        <w:ind w:left="5418" w:hanging="360"/>
+        <w:ind w:left="5760" w:hanging="360"/>
       </w:pPr>
     </w:lvl>
     <w:lvl w:ilvl="8" w:tplc="0409001B" w:tentative="1">
@@ -1206,11 +1117,269 @@
       <w:lvlText w:val="%9."/>
       <w:lvlJc w:val="right"/>
       <w:pPr>
-        <w:ind w:left="6138" w:hanging="180"/>
+        <w:ind w:left="6480" w:hanging="180"/>
       </w:pPr>
     </w:lvl>
   </w:abstractNum>
   <w:abstractNum w:abstractNumId="1">
+    <w:nsid w:val="10C5778E"/>
+    <w:multiLevelType w:val="hybridMultilevel"/>
+    <w:tmpl w:val="B9E8A418"/>
+    <w:lvl w:ilvl="0" w:tplc="0409000F">
+      <w:start w:val="1"/>
+      <w:numFmt w:val="decimal"/>
+      <w:lvlText w:val="%1."/>
+      <w:lvlJc w:val="left"/>
+      <w:pPr>
+        <w:ind w:left="2340" w:hanging="360"/>
+      </w:pPr>
+    </w:lvl>
+    <w:lvl w:ilvl="1" w:tplc="04090019" w:tentative="1">
+      <w:start w:val="1"/>
+      <w:numFmt w:val="lowerLetter"/>
+      <w:lvlText w:val="%2."/>
+      <w:lvlJc w:val="left"/>
+      <w:pPr>
+        <w:ind w:left="3060" w:hanging="360"/>
+      </w:pPr>
+    </w:lvl>
+    <w:lvl w:ilvl="2" w:tplc="0409001B" w:tentative="1">
+      <w:start w:val="1"/>
+      <w:numFmt w:val="lowerRoman"/>
+      <w:lvlText w:val="%3."/>
+      <w:lvlJc w:val="right"/>
+      <w:pPr>
+        <w:ind w:left="3780" w:hanging="180"/>
+      </w:pPr>
+    </w:lvl>
+    <w:lvl w:ilvl="3" w:tplc="0409000F" w:tentative="1">
+      <w:start w:val="1"/>
+      <w:numFmt w:val="decimal"/>
+      <w:lvlText w:val="%4."/>
+      <w:lvlJc w:val="left"/>
+      <w:pPr>
+        <w:ind w:left="4500" w:hanging="360"/>
+      </w:pPr>
+    </w:lvl>
+    <w:lvl w:ilvl="4" w:tplc="04090019" w:tentative="1">
+      <w:start w:val="1"/>
+      <w:numFmt w:val="lowerLetter"/>
+      <w:lvlText w:val="%5."/>
+      <w:lvlJc w:val="left"/>
+      <w:pPr>
+        <w:ind w:left="5220" w:hanging="360"/>
+      </w:pPr>
+    </w:lvl>
+    <w:lvl w:ilvl="5" w:tplc="0409001B" w:tentative="1">
+      <w:start w:val="1"/>
+      <w:numFmt w:val="lowerRoman"/>
+      <w:lvlText w:val="%6."/>
+      <w:lvlJc w:val="right"/>
+      <w:pPr>
+        <w:ind w:left="5940" w:hanging="180"/>
+      </w:pPr>
+    </w:lvl>
+    <w:lvl w:ilvl="6" w:tplc="0409000F" w:tentative="1">
+      <w:start w:val="1"/>
+      <w:numFmt w:val="decimal"/>
+      <w:lvlText w:val="%7."/>
+      <w:lvlJc w:val="left"/>
+      <w:pPr>
+        <w:ind w:left="6660" w:hanging="360"/>
+      </w:pPr>
+    </w:lvl>
+    <w:lvl w:ilvl="7" w:tplc="04090019" w:tentative="1">
+      <w:start w:val="1"/>
+      <w:numFmt w:val="lowerLetter"/>
+      <w:lvlText w:val="%8."/>
+      <w:lvlJc w:val="left"/>
+      <w:pPr>
+        <w:ind w:left="7380" w:hanging="360"/>
+      </w:pPr>
+    </w:lvl>
+    <w:lvl w:ilvl="8" w:tplc="0409001B" w:tentative="1">
+      <w:start w:val="1"/>
+      <w:numFmt w:val="lowerRoman"/>
+      <w:lvlText w:val="%9."/>
+      <w:lvlJc w:val="right"/>
+      <w:pPr>
+        <w:ind w:left="8100" w:hanging="180"/>
+      </w:pPr>
+    </w:lvl>
+  </w:abstractNum>
+  <w:abstractNum w:abstractNumId="2">
+    <w:nsid w:val="13A14946"/>
+    <w:multiLevelType w:val="hybridMultilevel"/>
+    <w:tmpl w:val="6EEA6184"/>
+    <w:lvl w:ilvl="0" w:tplc="0409000F">
+      <w:start w:val="1"/>
+      <w:numFmt w:val="decimal"/>
+      <w:lvlText w:val="%1."/>
+      <w:lvlJc w:val="left"/>
+      <w:pPr>
+        <w:ind w:left="1440" w:hanging="360"/>
+      </w:pPr>
+    </w:lvl>
+    <w:lvl w:ilvl="1" w:tplc="04090019" w:tentative="1">
+      <w:start w:val="1"/>
+      <w:numFmt w:val="lowerLetter"/>
+      <w:lvlText w:val="%2."/>
+      <w:lvlJc w:val="left"/>
+      <w:pPr>
+        <w:ind w:left="2160" w:hanging="360"/>
+      </w:pPr>
+    </w:lvl>
+    <w:lvl w:ilvl="2" w:tplc="0409001B" w:tentative="1">
+      <w:start w:val="1"/>
+      <w:numFmt w:val="lowerRoman"/>
+      <w:lvlText w:val="%3."/>
+      <w:lvlJc w:val="right"/>
+      <w:pPr>
+        <w:ind w:left="2880" w:hanging="180"/>
+      </w:pPr>
+    </w:lvl>
+    <w:lvl w:ilvl="3" w:tplc="0409000F" w:tentative="1">
+      <w:start w:val="1"/>
+      <w:numFmt w:val="decimal"/>
+      <w:lvlText w:val="%4."/>
+      <w:lvlJc w:val="left"/>
+      <w:pPr>
+        <w:ind w:left="3600" w:hanging="360"/>
+      </w:pPr>
+    </w:lvl>
+    <w:lvl w:ilvl="4" w:tplc="04090019" w:tentative="1">
+      <w:start w:val="1"/>
+      <w:numFmt w:val="lowerLetter"/>
+      <w:lvlText w:val="%5."/>
+      <w:lvlJc w:val="left"/>
+      <w:pPr>
+        <w:ind w:left="4320" w:hanging="360"/>
+      </w:pPr>
+    </w:lvl>
+    <w:lvl w:ilvl="5" w:tplc="0409001B" w:tentative="1">
+      <w:start w:val="1"/>
+      <w:numFmt w:val="lowerRoman"/>
+      <w:lvlText w:val="%6."/>
+      <w:lvlJc w:val="right"/>
+      <w:pPr>
+        <w:ind w:left="5040" w:hanging="180"/>
+      </w:pPr>
+    </w:lvl>
+    <w:lvl w:ilvl="6" w:tplc="0409000F" w:tentative="1">
+      <w:start w:val="1"/>
+      <w:numFmt w:val="decimal"/>
+      <w:lvlText w:val="%7."/>
+      <w:lvlJc w:val="left"/>
+      <w:pPr>
+        <w:ind w:left="5760" w:hanging="360"/>
+      </w:pPr>
+    </w:lvl>
+    <w:lvl w:ilvl="7" w:tplc="04090019" w:tentative="1">
+      <w:start w:val="1"/>
+      <w:numFmt w:val="lowerLetter"/>
+      <w:lvlText w:val="%8."/>
+      <w:lvlJc w:val="left"/>
+      <w:pPr>
+        <w:ind w:left="6480" w:hanging="360"/>
+      </w:pPr>
+    </w:lvl>
+    <w:lvl w:ilvl="8" w:tplc="0409001B" w:tentative="1">
+      <w:start w:val="1"/>
+      <w:numFmt w:val="lowerRoman"/>
+      <w:lvlText w:val="%9."/>
+      <w:lvlJc w:val="right"/>
+      <w:pPr>
+        <w:ind w:left="7200" w:hanging="180"/>
+      </w:pPr>
+    </w:lvl>
+  </w:abstractNum>
+  <w:abstractNum w:abstractNumId="3">
+    <w:nsid w:val="1C3F44E4"/>
+    <w:multiLevelType w:val="hybridMultilevel"/>
+    <w:tmpl w:val="4CAE1BF0"/>
+    <w:lvl w:ilvl="0" w:tplc="0409000F">
+      <w:start w:val="1"/>
+      <w:numFmt w:val="decimal"/>
+      <w:lvlText w:val="%1."/>
+      <w:lvlJc w:val="left"/>
+      <w:pPr>
+        <w:ind w:left="720" w:hanging="360"/>
+      </w:pPr>
+    </w:lvl>
+    <w:lvl w:ilvl="1" w:tplc="04090019" w:tentative="1">
+      <w:start w:val="1"/>
+      <w:numFmt w:val="lowerLetter"/>
+      <w:lvlText w:val="%2."/>
+      <w:lvlJc w:val="left"/>
+      <w:pPr>
+        <w:ind w:left="1440" w:hanging="360"/>
+      </w:pPr>
+    </w:lvl>
+    <w:lvl w:ilvl="2" w:tplc="0409001B">
+      <w:start w:val="1"/>
+      <w:numFmt w:val="lowerRoman"/>
+      <w:lvlText w:val="%3."/>
+      <w:lvlJc w:val="right"/>
+      <w:pPr>
+        <w:ind w:left="2160" w:hanging="180"/>
+      </w:pPr>
+    </w:lvl>
+    <w:lvl w:ilvl="3" w:tplc="0409000F" w:tentative="1">
+      <w:start w:val="1"/>
+      <w:numFmt w:val="decimal"/>
+      <w:lvlText w:val="%4."/>
+      <w:lvlJc w:val="left"/>
+      <w:pPr>
+        <w:ind w:left="2880" w:hanging="360"/>
+      </w:pPr>
+    </w:lvl>
+    <w:lvl w:ilvl="4" w:tplc="04090019" w:tentative="1">
+      <w:start w:val="1"/>
+      <w:numFmt w:val="lowerLetter"/>
+      <w:lvlText w:val="%5."/>
+      <w:lvlJc w:val="left"/>
+      <w:pPr>
+        <w:ind w:left="3600" w:hanging="360"/>
+      </w:pPr>
+    </w:lvl>
+    <w:lvl w:ilvl="5" w:tplc="0409001B" w:tentative="1">
+      <w:start w:val="1"/>
+      <w:numFmt w:val="lowerRoman"/>
+      <w:lvlText w:val="%6."/>
+      <w:lvlJc w:val="right"/>
+      <w:pPr>
+        <w:ind w:left="4320" w:hanging="180"/>
+      </w:pPr>
+    </w:lvl>
+    <w:lvl w:ilvl="6" w:tplc="0409000F" w:tentative="1">
+      <w:start w:val="1"/>
+      <w:numFmt w:val="decimal"/>
+      <w:lvlText w:val="%7."/>
+      <w:lvlJc w:val="left"/>
+      <w:pPr>
+        <w:ind w:left="5040" w:hanging="360"/>
+      </w:pPr>
+    </w:lvl>
+    <w:lvl w:ilvl="7" w:tplc="04090019" w:tentative="1">
+      <w:start w:val="1"/>
+      <w:numFmt w:val="lowerLetter"/>
+      <w:lvlText w:val="%8."/>
+      <w:lvlJc w:val="left"/>
+      <w:pPr>
+        <w:ind w:left="5760" w:hanging="360"/>
+      </w:pPr>
+    </w:lvl>
+    <w:lvl w:ilvl="8" w:tplc="0409001B" w:tentative="1">
+      <w:start w:val="1"/>
+      <w:numFmt w:val="lowerRoman"/>
+      <w:lvlText w:val="%9."/>
+      <w:lvlJc w:val="right"/>
+      <w:pPr>
+        <w:ind w:left="6480" w:hanging="180"/>
+      </w:pPr>
+    </w:lvl>
+  </w:abstractNum>
+  <w:abstractNum w:abstractNumId="4">
     <w:nsid w:val="1FE269E0"/>
     <w:multiLevelType w:val="hybridMultilevel"/>
     <w:tmpl w:val="45261E14"/>
@@ -1299,120 +1468,93 @@
       </w:pPr>
     </w:lvl>
   </w:abstractNum>
-  <w:abstractNum w:abstractNumId="2">
-    <w:nsid w:val="3043322A"/>
+  <w:abstractNum w:abstractNumId="5">
+    <w:nsid w:val="3234238B"/>
     <w:multiLevelType w:val="hybridMultilevel"/>
-    <w:tmpl w:val="786E8038"/>
-    <w:lvl w:ilvl="0" w:tplc="04090001">
-      <w:start w:val="1"/>
-      <w:numFmt w:val="bullet"/>
-      <w:lvlText w:val=""/>
-      <w:lvlJc w:val="left"/>
-      <w:pPr>
-        <w:ind w:left="90" w:hanging="360"/>
-      </w:pPr>
-      <w:rPr>
-        <w:rFonts w:ascii="Symbol" w:hAnsi="Symbol" w:hint="default"/>
-      </w:rPr>
-    </w:lvl>
-    <w:lvl w:ilvl="1" w:tplc="04090003" w:tentative="1">
-      <w:start w:val="1"/>
-      <w:numFmt w:val="bullet"/>
-      <w:lvlText w:val="o"/>
-      <w:lvlJc w:val="left"/>
-      <w:pPr>
-        <w:ind w:left="810" w:hanging="360"/>
-      </w:pPr>
-      <w:rPr>
-        <w:rFonts w:ascii="Courier New" w:hAnsi="Courier New" w:cs="Courier New" w:hint="default"/>
-      </w:rPr>
-    </w:lvl>
-    <w:lvl w:ilvl="2" w:tplc="04090005" w:tentative="1">
-      <w:start w:val="1"/>
-      <w:numFmt w:val="bullet"/>
-      <w:lvlText w:val=""/>
-      <w:lvlJc w:val="left"/>
-      <w:pPr>
-        <w:ind w:left="1530" w:hanging="360"/>
-      </w:pPr>
-      <w:rPr>
-        <w:rFonts w:ascii="Wingdings" w:hAnsi="Wingdings" w:hint="default"/>
-      </w:rPr>
-    </w:lvl>
-    <w:lvl w:ilvl="3" w:tplc="04090001" w:tentative="1">
-      <w:start w:val="1"/>
-      <w:numFmt w:val="bullet"/>
-      <w:lvlText w:val=""/>
-      <w:lvlJc w:val="left"/>
-      <w:pPr>
-        <w:ind w:left="2250" w:hanging="360"/>
-      </w:pPr>
-      <w:rPr>
-        <w:rFonts w:ascii="Symbol" w:hAnsi="Symbol" w:hint="default"/>
-      </w:rPr>
-    </w:lvl>
-    <w:lvl w:ilvl="4" w:tplc="04090003" w:tentative="1">
-      <w:start w:val="1"/>
-      <w:numFmt w:val="bullet"/>
-      <w:lvlText w:val="o"/>
-      <w:lvlJc w:val="left"/>
-      <w:pPr>
-        <w:ind w:left="2970" w:hanging="360"/>
-      </w:pPr>
-      <w:rPr>
-        <w:rFonts w:ascii="Courier New" w:hAnsi="Courier New" w:cs="Courier New" w:hint="default"/>
-      </w:rPr>
-    </w:lvl>
-    <w:lvl w:ilvl="5" w:tplc="04090005" w:tentative="1">
-      <w:start w:val="1"/>
-      <w:numFmt w:val="bullet"/>
-      <w:lvlText w:val=""/>
-      <w:lvlJc w:val="left"/>
-      <w:pPr>
-        <w:ind w:left="3690" w:hanging="360"/>
-      </w:pPr>
-      <w:rPr>
-        <w:rFonts w:ascii="Wingdings" w:hAnsi="Wingdings" w:hint="default"/>
-      </w:rPr>
-    </w:lvl>
-    <w:lvl w:ilvl="6" w:tplc="04090001" w:tentative="1">
-      <w:start w:val="1"/>
-      <w:numFmt w:val="bullet"/>
-      <w:lvlText w:val=""/>
-      <w:lvlJc w:val="left"/>
-      <w:pPr>
-        <w:ind w:left="4410" w:hanging="360"/>
-      </w:pPr>
-      <w:rPr>
-        <w:rFonts w:ascii="Symbol" w:hAnsi="Symbol" w:hint="default"/>
-      </w:rPr>
-    </w:lvl>
-    <w:lvl w:ilvl="7" w:tplc="04090003">
-      <w:start w:val="1"/>
-      <w:numFmt w:val="bullet"/>
-      <w:lvlText w:val="o"/>
-      <w:lvlJc w:val="left"/>
-      <w:pPr>
-        <w:ind w:left="5130" w:hanging="360"/>
-      </w:pPr>
-      <w:rPr>
-        <w:rFonts w:ascii="Courier New" w:hAnsi="Courier New" w:cs="Courier New" w:hint="default"/>
-      </w:rPr>
-    </w:lvl>
-    <w:lvl w:ilvl="8" w:tplc="04090005">
-      <w:start w:val="1"/>
-      <w:numFmt w:val="bullet"/>
-      <w:lvlText w:val=""/>
-      <w:lvlJc w:val="left"/>
-      <w:pPr>
-        <w:ind w:left="5850" w:hanging="360"/>
-      </w:pPr>
-      <w:rPr>
-        <w:rFonts w:ascii="Wingdings" w:hAnsi="Wingdings" w:hint="default"/>
-      </w:rPr>
+    <w:tmpl w:val="9BD260EA"/>
+    <w:lvl w:ilvl="0" w:tplc="0409000F">
+      <w:start w:val="1"/>
+      <w:numFmt w:val="decimal"/>
+      <w:lvlText w:val="%1."/>
+      <w:lvlJc w:val="left"/>
+      <w:pPr>
+        <w:ind w:left="1458" w:hanging="360"/>
+      </w:pPr>
+    </w:lvl>
+    <w:lvl w:ilvl="1" w:tplc="04090019" w:tentative="1">
+      <w:start w:val="1"/>
+      <w:numFmt w:val="lowerLetter"/>
+      <w:lvlText w:val="%2."/>
+      <w:lvlJc w:val="left"/>
+      <w:pPr>
+        <w:ind w:left="2178" w:hanging="360"/>
+      </w:pPr>
+    </w:lvl>
+    <w:lvl w:ilvl="2" w:tplc="0409001B" w:tentative="1">
+      <w:start w:val="1"/>
+      <w:numFmt w:val="lowerRoman"/>
+      <w:lvlText w:val="%3."/>
+      <w:lvlJc w:val="right"/>
+      <w:pPr>
+        <w:ind w:left="2898" w:hanging="180"/>
+      </w:pPr>
+    </w:lvl>
+    <w:lvl w:ilvl="3" w:tplc="0409000F" w:tentative="1">
+      <w:start w:val="1"/>
+      <w:numFmt w:val="decimal"/>
+      <w:lvlText w:val="%4."/>
+      <w:lvlJc w:val="left"/>
+      <w:pPr>
+        <w:ind w:left="3618" w:hanging="360"/>
+      </w:pPr>
+    </w:lvl>
+    <w:lvl w:ilvl="4" w:tplc="04090019" w:tentative="1">
+      <w:start w:val="1"/>
+      <w:numFmt w:val="lowerLetter"/>
+      <w:lvlText w:val="%5."/>
+      <w:lvlJc w:val="left"/>
+      <w:pPr>
+        <w:ind w:left="4338" w:hanging="360"/>
+      </w:pPr>
+    </w:lvl>
+    <w:lvl w:ilvl="5" w:tplc="0409001B" w:tentative="1">
+      <w:start w:val="1"/>
+      <w:numFmt w:val="lowerRoman"/>
+      <w:lvlText w:val="%6."/>
+      <w:lvlJc w:val="right"/>
+      <w:pPr>
+        <w:ind w:left="5058" w:hanging="180"/>
+      </w:pPr>
+    </w:lvl>
+    <w:lvl w:ilvl="6" w:tplc="0409000F" w:tentative="1">
+      <w:start w:val="1"/>
+      <w:numFmt w:val="decimal"/>
+      <w:lvlText w:val="%7."/>
+      <w:lvlJc w:val="left"/>
+      <w:pPr>
+        <w:ind w:left="5778" w:hanging="360"/>
+      </w:pPr>
+    </w:lvl>
+    <w:lvl w:ilvl="7" w:tplc="04090019" w:tentative="1">
+      <w:start w:val="1"/>
+      <w:numFmt w:val="lowerLetter"/>
+      <w:lvlText w:val="%8."/>
+      <w:lvlJc w:val="left"/>
+      <w:pPr>
+        <w:ind w:left="6498" w:hanging="360"/>
+      </w:pPr>
+    </w:lvl>
+    <w:lvl w:ilvl="8" w:tplc="0409001B" w:tentative="1">
+      <w:start w:val="1"/>
+      <w:numFmt w:val="lowerRoman"/>
+      <w:lvlText w:val="%9."/>
+      <w:lvlJc w:val="right"/>
+      <w:pPr>
+        <w:ind w:left="7218" w:hanging="180"/>
+      </w:pPr>
     </w:lvl>
   </w:abstractNum>
-  <w:abstractNum w:abstractNumId="3">
+  <w:abstractNum w:abstractNumId="6">
     <w:nsid w:val="44E82951"/>
     <w:multiLevelType w:val="hybridMultilevel"/>
     <w:tmpl w:val="623C1E1C"/>
@@ -1501,17 +1643,118 @@
       </w:pPr>
     </w:lvl>
   </w:abstractNum>
+  <w:abstractNum w:abstractNumId="7">
+    <w:nsid w:val="75A220B4"/>
+    <w:multiLevelType w:val="hybridMultilevel"/>
+    <w:tmpl w:val="CBBC7478"/>
+    <w:lvl w:ilvl="0" w:tplc="0409000F">
+      <w:start w:val="1"/>
+      <w:numFmt w:val="decimal"/>
+      <w:lvlText w:val="%1."/>
+      <w:lvlJc w:val="left"/>
+      <w:pPr>
+        <w:ind w:left="720" w:hanging="360"/>
+      </w:pPr>
+    </w:lvl>
+    <w:lvl w:ilvl="1" w:tplc="04090019" w:tentative="1">
+      <w:start w:val="1"/>
+      <w:numFmt w:val="lowerLetter"/>
+      <w:lvlText w:val="%2."/>
+      <w:lvlJc w:val="left"/>
+      <w:pPr>
+        <w:ind w:left="1440" w:hanging="360"/>
+      </w:pPr>
+    </w:lvl>
+    <w:lvl w:ilvl="2" w:tplc="0409000F">
+      <w:start w:val="1"/>
+      <w:numFmt w:val="decimal"/>
+      <w:lvlText w:val="%3."/>
+      <w:lvlJc w:val="left"/>
+      <w:pPr>
+        <w:ind w:left="2160" w:hanging="180"/>
+      </w:pPr>
+      <w:rPr>
+        <w:rFonts w:hint="default"/>
+      </w:rPr>
+    </w:lvl>
+    <w:lvl w:ilvl="3" w:tplc="0409000F" w:tentative="1">
+      <w:start w:val="1"/>
+      <w:numFmt w:val="decimal"/>
+      <w:lvlText w:val="%4."/>
+      <w:lvlJc w:val="left"/>
+      <w:pPr>
+        <w:ind w:left="2880" w:hanging="360"/>
+      </w:pPr>
+    </w:lvl>
+    <w:lvl w:ilvl="4" w:tplc="04090019" w:tentative="1">
+      <w:start w:val="1"/>
+      <w:numFmt w:val="lowerLetter"/>
+      <w:lvlText w:val="%5."/>
+      <w:lvlJc w:val="left"/>
+      <w:pPr>
+        <w:ind w:left="3600" w:hanging="360"/>
+      </w:pPr>
+    </w:lvl>
+    <w:lvl w:ilvl="5" w:tplc="0409001B" w:tentative="1">
+      <w:start w:val="1"/>
+      <w:numFmt w:val="lowerRoman"/>
+      <w:lvlText w:val="%6."/>
+      <w:lvlJc w:val="right"/>
+      <w:pPr>
+        <w:ind w:left="4320" w:hanging="180"/>
+      </w:pPr>
+    </w:lvl>
+    <w:lvl w:ilvl="6" w:tplc="0409000F" w:tentative="1">
+      <w:start w:val="1"/>
+      <w:numFmt w:val="decimal"/>
+      <w:lvlText w:val="%7."/>
+      <w:lvlJc w:val="left"/>
+      <w:pPr>
+        <w:ind w:left="5040" w:hanging="360"/>
+      </w:pPr>
+    </w:lvl>
+    <w:lvl w:ilvl="7" w:tplc="04090019" w:tentative="1">
+      <w:start w:val="1"/>
+      <w:numFmt w:val="lowerLetter"/>
+      <w:lvlText w:val="%8."/>
+      <w:lvlJc w:val="left"/>
+      <w:pPr>
+        <w:ind w:left="5760" w:hanging="360"/>
+      </w:pPr>
+    </w:lvl>
+    <w:lvl w:ilvl="8" w:tplc="0409001B" w:tentative="1">
+      <w:start w:val="1"/>
+      <w:numFmt w:val="lowerRoman"/>
+      <w:lvlText w:val="%9."/>
+      <w:lvlJc w:val="right"/>
+      <w:pPr>
+        <w:ind w:left="6480" w:hanging="180"/>
+      </w:pPr>
+    </w:lvl>
+  </w:abstractNum>
   <w:num w:numId="1">
-    <w:abstractNumId w:val="2"/>
+    <w:abstractNumId w:val="4"/>
   </w:num>
   <w:num w:numId="2">
+    <w:abstractNumId w:val="6"/>
+  </w:num>
+  <w:num w:numId="3">
+    <w:abstractNumId w:val="3"/>
+  </w:num>
+  <w:num w:numId="4">
+    <w:abstractNumId w:val="7"/>
+  </w:num>
+  <w:num w:numId="5">
+    <w:abstractNumId w:val="5"/>
+  </w:num>
+  <w:num w:numId="6">
     <w:abstractNumId w:val="0"/>
   </w:num>
-  <w:num w:numId="3">
+  <w:num w:numId="7">
     <w:abstractNumId w:val="1"/>
   </w:num>
-  <w:num w:numId="4">
-    <w:abstractNumId w:val="3"/>
+  <w:num w:numId="8">
+    <w:abstractNumId w:val="2"/>
   </w:num>
 </w:numbering>
 </file>
@@ -1675,7 +1918,7 @@
   <w:style w:type="paragraph" w:default="1" w:styleId="Normal">
     <w:name w:val="Normal"/>
     <w:qFormat/>
-    <w:rsid w:val="00AE7F31"/>
+    <w:rsid w:val="00875F1B"/>
   </w:style>
   <w:style w:type="character" w:default="1" w:styleId="DefaultParagraphFont">
     <w:name w:val="Default Paragraph Font"/>
@@ -1705,6 +1948,17 @@
     <w:semiHidden/>
     <w:unhideWhenUsed/>
   </w:style>
+  <w:style w:type="character" w:styleId="Hyperlink">
+    <w:name w:val="Hyperlink"/>
+    <w:basedOn w:val="DefaultParagraphFont"/>
+    <w:uiPriority w:val="99"/>
+    <w:unhideWhenUsed/>
+    <w:rsid w:val="00875F1B"/>
+    <w:rPr>
+      <w:color w:val="0000FF" w:themeColor="hyperlink"/>
+      <w:u w:val="single"/>
+    </w:rPr>
+  </w:style>
   <w:style w:type="paragraph" w:styleId="BalloonText">
     <w:name w:val="Balloon Text"/>
     <w:basedOn w:val="Normal"/>
@@ -1712,7 +1966,7 @@
     <w:uiPriority w:val="99"/>
     <w:semiHidden/>
     <w:unhideWhenUsed/>
-    <w:rsid w:val="007A2A72"/>
+    <w:rsid w:val="00875F1B"/>
     <w:pPr>
       <w:spacing w:after="0" w:line="240" w:lineRule="auto"/>
     </w:pPr>
@@ -1728,22 +1982,11 @@
     <w:link w:val="BalloonText"/>
     <w:uiPriority w:val="99"/>
     <w:semiHidden/>
-    <w:rsid w:val="007A2A72"/>
+    <w:rsid w:val="00875F1B"/>
     <w:rPr>
       <w:rFonts w:ascii="Tahoma" w:hAnsi="Tahoma" w:cs="Tahoma"/>
       <w:sz w:val="16"/>
       <w:szCs w:val="16"/>
-    </w:rPr>
-  </w:style>
-  <w:style w:type="character" w:styleId="Hyperlink">
-    <w:name w:val="Hyperlink"/>
-    <w:basedOn w:val="DefaultParagraphFont"/>
-    <w:uiPriority w:val="99"/>
-    <w:unhideWhenUsed/>
-    <w:rsid w:val="007A2A72"/>
-    <w:rPr>
-      <w:color w:val="0000FF" w:themeColor="hyperlink"/>
-      <w:u w:val="single"/>
     </w:rPr>
   </w:style>
   <w:style w:type="paragraph" w:styleId="ListParagraph">
@@ -1751,7 +1994,7 @@
     <w:basedOn w:val="Normal"/>
     <w:uiPriority w:val="34"/>
     <w:qFormat/>
-    <w:rsid w:val="00E17DFC"/>
+    <w:rsid w:val="00875F1B"/>
     <w:pPr>
       <w:ind w:left="720"/>
       <w:contextualSpacing/>

</xml_diff>